<commit_message>
Core java 1: update reflection
</commit_message>
<xml_diff>
--- a/Core-Java-1/0_Documents/5.docx
+++ b/Core-Java-1/0_Documents/5.docx
@@ -1,6 +1,6 @@
 
 <file path=word/document.xml><?xml version="1.0" encoding="utf-8"?>
-<w:document xmlns:wpc="http://schemas.microsoft.com/office/word/2010/wordprocessingCanvas" xmlns:cx="http://schemas.microsoft.com/office/drawing/2014/chartex" xmlns:mc="http://schemas.openxmlformats.org/markup-compatibility/2006" xmlns:o="urn:schemas-microsoft-com:office:office" xmlns:r="http://schemas.openxmlformats.org/officeDocument/2006/relationships" xmlns:m="http://schemas.openxmlformats.org/officeDocument/2006/math" xmlns:v="urn:schemas-microsoft-com:vml" xmlns:wp14="http://schemas.microsoft.com/office/word/2010/wordprocessingDrawing" xmlns:wp="http://schemas.openxmlformats.org/drawingml/2006/wordprocessingDrawing" xmlns:w10="urn:schemas-microsoft-com:office:word" xmlns:w="http://schemas.openxmlformats.org/wordprocessingml/2006/main" xmlns:w14="http://schemas.microsoft.com/office/word/2010/wordml" xmlns:w15="http://schemas.microsoft.com/office/word/2012/wordml" xmlns:w16se="http://schemas.microsoft.com/office/word/2015/wordml/symex" xmlns:wpg="http://schemas.microsoft.com/office/word/2010/wordprocessingGroup" xmlns:wpi="http://schemas.microsoft.com/office/word/2010/wordprocessingInk" xmlns:wne="http://schemas.microsoft.com/office/word/2006/wordml" xmlns:wps="http://schemas.microsoft.com/office/word/2010/wordprocessingShape" mc:Ignorable="w14 w15 w16se wp14">
+<w:document xmlns:wpc="http://schemas.microsoft.com/office/word/2010/wordprocessingCanvas" xmlns:cx="http://schemas.microsoft.com/office/drawing/2014/chartex" xmlns:cx1="http://schemas.microsoft.com/office/drawing/2015/9/8/chartex" xmlns:cx2="http://schemas.microsoft.com/office/drawing/2015/10/21/chartex" xmlns:cx3="http://schemas.microsoft.com/office/drawing/2016/5/9/chartex" xmlns:cx4="http://schemas.microsoft.com/office/drawing/2016/5/10/chartex" xmlns:cx5="http://schemas.microsoft.com/office/drawing/2016/5/11/chartex" xmlns:cx6="http://schemas.microsoft.com/office/drawing/2016/5/12/chartex" xmlns:cx7="http://schemas.microsoft.com/office/drawing/2016/5/13/chartex" xmlns:cx8="http://schemas.microsoft.com/office/drawing/2016/5/14/chartex" xmlns:mc="http://schemas.openxmlformats.org/markup-compatibility/2006" xmlns:aink="http://schemas.microsoft.com/office/drawing/2016/ink" xmlns:am3d="http://schemas.microsoft.com/office/drawing/2017/model3d" xmlns:o="urn:schemas-microsoft-com:office:office" xmlns:oel="http://schemas.microsoft.com/office/2019/extlst" xmlns:r="http://schemas.openxmlformats.org/officeDocument/2006/relationships" xmlns:m="http://schemas.openxmlformats.org/officeDocument/2006/math" xmlns:v="urn:schemas-microsoft-com:vml" xmlns:wp14="http://schemas.microsoft.com/office/word/2010/wordprocessingDrawing" xmlns:wp="http://schemas.openxmlformats.org/drawingml/2006/wordprocessingDrawing" xmlns:w10="urn:schemas-microsoft-com:office:word" xmlns:w="http://schemas.openxmlformats.org/wordprocessingml/2006/main" xmlns:w14="http://schemas.microsoft.com/office/word/2010/wordml" xmlns:w15="http://schemas.microsoft.com/office/word/2012/wordml" xmlns:w16cex="http://schemas.microsoft.com/office/word/2018/wordml/cex" xmlns:w16cid="http://schemas.microsoft.com/office/word/2016/wordml/cid" xmlns:w16="http://schemas.microsoft.com/office/word/2018/wordml" xmlns:w16du="http://schemas.microsoft.com/office/word/2023/wordml/word16du" xmlns:w16sdtdh="http://schemas.microsoft.com/office/word/2020/wordml/sdtdatahash" xmlns:w16sdtfl="http://schemas.microsoft.com/office/word/2024/wordml/sdtformatlock" xmlns:w16se="http://schemas.microsoft.com/office/word/2015/wordml/symex" xmlns:wpg="http://schemas.microsoft.com/office/word/2010/wordprocessingGroup" xmlns:wpi="http://schemas.microsoft.com/office/word/2010/wordprocessingInk" xmlns:wne="http://schemas.microsoft.com/office/word/2006/wordml" xmlns:wps="http://schemas.microsoft.com/office/word/2010/wordprocessingShape" mc:Ignorable="w14 w15 w16se w16cid w16 w16cex w16sdtdh w16sdtfl w16du wp14">
   <w:body>
     <w:p>
       <w:pPr>
@@ -1052,23 +1052,7 @@
           <w:sz w:val="40"/>
           <w:szCs w:val="40"/>
         </w:rPr>
-        <w:t>+</w:t>
-      </w:r>
-      <w:proofErr w:type="gramStart"/>
-      <w:r>
-        <w:rPr>
-          <w:sz w:val="40"/>
-          <w:szCs w:val="40"/>
-        </w:rPr>
-        <w:t>staff[</w:t>
-      </w:r>
-      <w:proofErr w:type="gramEnd"/>
-      <w:r>
-        <w:rPr>
-          <w:sz w:val="40"/>
-          <w:szCs w:val="40"/>
-        </w:rPr>
-        <w:t>0] and boss refer to same object, but staff[0] is considered to be only an Employee object</w:t>
+        <w:t>+staff[0] and boss refer to same object, but staff[0] is considered to be only an Employee object</w:t>
       </w:r>
     </w:p>
     <w:p>
@@ -1170,7 +1154,6 @@
         <w:t>-</w:t>
       </w:r>
       <w:proofErr w:type="spellStart"/>
-      <w:proofErr w:type="gramStart"/>
       <w:r>
         <w:rPr>
           <w:sz w:val="40"/>
@@ -1179,7 +1162,6 @@
         <w:t>x.f</w:t>
       </w:r>
       <w:proofErr w:type="spellEnd"/>
-      <w:proofErr w:type="gramEnd"/>
       <w:r>
         <w:rPr>
           <w:sz w:val="40"/>
@@ -2072,23 +2054,7 @@
           <w:sz w:val="40"/>
           <w:szCs w:val="40"/>
         </w:rPr>
-        <w:t xml:space="preserve">e but refer a </w:t>
-      </w:r>
-      <w:proofErr w:type="spellStart"/>
-      <w:r>
-        <w:rPr>
-          <w:sz w:val="40"/>
-          <w:szCs w:val="40"/>
-        </w:rPr>
-        <w:t>nonabstract</w:t>
-      </w:r>
-      <w:proofErr w:type="spellEnd"/>
-      <w:r>
-        <w:rPr>
-          <w:sz w:val="40"/>
-          <w:szCs w:val="40"/>
-        </w:rPr>
-        <w:t xml:space="preserve"> class. The variable always refers to an object </w:t>
+        <w:t xml:space="preserve">e but refer a nonabstract class. The variable always refers to an object </w:t>
       </w:r>
       <w:r>
         <w:rPr>
@@ -2838,22 +2804,13 @@
           <w:szCs w:val="40"/>
         </w:rPr>
       </w:pPr>
-      <w:proofErr w:type="gramStart"/>
       <w:r>
         <w:rPr>
           <w:sz w:val="40"/>
           <w:szCs w:val="40"/>
         </w:rPr>
         <w:lastRenderedPageBreak/>
-        <w:t>equals(</w:t>
-      </w:r>
-      <w:proofErr w:type="gramEnd"/>
-      <w:r>
-        <w:rPr>
-          <w:sz w:val="40"/>
-          <w:szCs w:val="40"/>
-        </w:rPr>
-        <w:t xml:space="preserve">Object </w:t>
+        <w:t xml:space="preserve">equals(Object </w:t>
       </w:r>
       <w:proofErr w:type="spellStart"/>
       <w:r>
@@ -3709,21 +3666,12 @@
         <w:t>system.out.x</w:t>
       </w:r>
       <w:proofErr w:type="spellEnd"/>
-      <w:proofErr w:type="gramStart"/>
-      <w:r>
-        <w:rPr>
-          <w:sz w:val="40"/>
-          <w:szCs w:val="40"/>
-        </w:rPr>
-        <w:t>),string</w:t>
-      </w:r>
-      <w:proofErr w:type="gramEnd"/>
-      <w:r>
-        <w:rPr>
-          <w:sz w:val="40"/>
-          <w:szCs w:val="40"/>
-        </w:rPr>
-        <w:t xml:space="preserve"> +x</w:t>
+      <w:r>
+        <w:rPr>
+          <w:sz w:val="40"/>
+          <w:szCs w:val="40"/>
+        </w:rPr>
+        <w:t>),string +x</w:t>
       </w:r>
     </w:p>
     <w:p>
@@ -3978,7 +3926,7 @@
           <w:szCs w:val="40"/>
         </w:rPr>
         <w:drawing>
-          <wp:anchor distT="0" distB="0" distL="114300" distR="114300" simplePos="0" relativeHeight="251658240" behindDoc="0" locked="0" layoutInCell="1" allowOverlap="1">
+          <wp:anchor distT="0" distB="0" distL="114300" distR="114300" simplePos="0" relativeHeight="251658240" behindDoc="0" locked="0" layoutInCell="1" allowOverlap="1" wp14:anchorId="328522E9" wp14:editId="389904B6">
             <wp:simplePos x="914400" y="1848255"/>
             <wp:positionH relativeFrom="column">
               <wp:align>left</wp:align>
@@ -5348,25 +5296,7 @@
           <w:sz w:val="40"/>
           <w:szCs w:val="40"/>
         </w:rPr>
-        <w:t>@</w:t>
-      </w:r>
-      <w:proofErr w:type="spellStart"/>
-      <w:r>
-        <w:rPr>
-          <w:b/>
-          <w:sz w:val="40"/>
-          <w:szCs w:val="40"/>
-        </w:rPr>
-        <w:t>SuppressWarnings</w:t>
-      </w:r>
-      <w:proofErr w:type="spellEnd"/>
-      <w:r>
-        <w:rPr>
-          <w:b/>
-          <w:sz w:val="40"/>
-          <w:szCs w:val="40"/>
-        </w:rPr>
-        <w:t>("unchecked")</w:t>
+        <w:t>@SuppressWarnings("unchecked")</w:t>
       </w:r>
       <w:r>
         <w:rPr>
@@ -5440,17 +5370,8 @@
           <w:szCs w:val="40"/>
         </w:rPr>
         <w:lastRenderedPageBreak/>
-        <w:t xml:space="preserve">5.4 Object Wrappers and </w:t>
-      </w:r>
-      <w:proofErr w:type="spellStart"/>
-      <w:r>
-        <w:rPr>
-          <w:sz w:val="40"/>
-          <w:szCs w:val="40"/>
-        </w:rPr>
-        <w:t>Autoboxing</w:t>
-      </w:r>
-      <w:proofErr w:type="spellEnd"/>
+        <w:t>5.4 Object Wrappers and Autoboxing</w:t>
+      </w:r>
     </w:p>
     <w:p>
       <w:pPr>
@@ -5568,7 +5489,6 @@
         </w:rPr>
         <w:t>-</w:t>
       </w:r>
-      <w:proofErr w:type="spellStart"/>
       <w:r>
         <w:rPr>
           <w:i/>
@@ -5577,7 +5497,6 @@
         </w:rPr>
         <w:t>Autoboxing</w:t>
       </w:r>
-      <w:proofErr w:type="spellEnd"/>
       <w:r>
         <w:rPr>
           <w:sz w:val="40"/>
@@ -5769,23 +5688,7 @@
           <w:sz w:val="40"/>
           <w:szCs w:val="40"/>
         </w:rPr>
-        <w:t>-</w:t>
-      </w:r>
-      <w:proofErr w:type="spellStart"/>
-      <w:r>
-        <w:rPr>
-          <w:sz w:val="40"/>
-          <w:szCs w:val="40"/>
-        </w:rPr>
-        <w:t>Autoboxing</w:t>
-      </w:r>
-      <w:proofErr w:type="spellEnd"/>
-      <w:r>
-        <w:rPr>
-          <w:sz w:val="40"/>
-          <w:szCs w:val="40"/>
-        </w:rPr>
-        <w:t xml:space="preserve"> and unboxed work with arithmetic expression</w:t>
+        <w:t>-Autoboxing and unboxed work with arithmetic expression</w:t>
       </w:r>
     </w:p>
     <w:p>
@@ -6075,7 +5978,6 @@
         <w:t xml:space="preserve">types </w:t>
       </w:r>
       <w:proofErr w:type="spellStart"/>
-      <w:proofErr w:type="gramStart"/>
       <w:r>
         <w:rPr>
           <w:sz w:val="40"/>
@@ -6084,7 +5986,6 @@
         <w:t>org.omg.CORBA</w:t>
       </w:r>
       <w:proofErr w:type="spellEnd"/>
-      <w:proofErr w:type="gramEnd"/>
       <w:r>
         <w:rPr>
           <w:sz w:val="40"/>
@@ -6212,7 +6113,7 @@
           <w:noProof/>
         </w:rPr>
         <w:drawing>
-          <wp:anchor distT="0" distB="0" distL="114300" distR="114300" simplePos="0" relativeHeight="251659264" behindDoc="0" locked="0" layoutInCell="1" allowOverlap="1">
+          <wp:anchor distT="0" distB="0" distL="114300" distR="114300" simplePos="0" relativeHeight="251659264" behindDoc="0" locked="0" layoutInCell="1" allowOverlap="1" wp14:anchorId="61567935" wp14:editId="4D74BDD8">
             <wp:simplePos x="914400" y="4805464"/>
             <wp:positionH relativeFrom="column">
               <wp:align>left</wp:align>
@@ -6318,17 +6219,8 @@
           <w:sz w:val="40"/>
           <w:szCs w:val="40"/>
         </w:rPr>
-        <w:t xml:space="preserve">5.6 </w:t>
-      </w:r>
-      <w:proofErr w:type="gramStart"/>
-      <w:r>
-        <w:rPr>
-          <w:sz w:val="40"/>
-          <w:szCs w:val="40"/>
-        </w:rPr>
-        <w:t>Enumeration  Classes</w:t>
-      </w:r>
-      <w:proofErr w:type="gramEnd"/>
+        <w:t>5.6 Enumeration  Classes</w:t>
+      </w:r>
     </w:p>
     <w:p>
       <w:pPr>
@@ -6443,6 +6335,144 @@
           <w:sz w:val="40"/>
           <w:szCs w:val="40"/>
         </w:rPr>
+        <w:t xml:space="preserve">-Enum type is a data type that enables for a variable to be a set of predefined </w:t>
+      </w:r>
+      <w:r>
+        <w:rPr>
+          <w:b/>
+          <w:sz w:val="40"/>
+          <w:szCs w:val="40"/>
+        </w:rPr>
+        <w:t>constants</w:t>
+      </w:r>
+      <w:r>
+        <w:rPr>
+          <w:sz w:val="40"/>
+          <w:szCs w:val="40"/>
+        </w:rPr>
+        <w:t xml:space="preserve">.-&gt; </w:t>
+      </w:r>
+      <w:proofErr w:type="spellStart"/>
+      <w:r>
+        <w:rPr>
+          <w:sz w:val="40"/>
+          <w:szCs w:val="40"/>
+        </w:rPr>
+        <w:t>enum</w:t>
+      </w:r>
+      <w:proofErr w:type="spellEnd"/>
+      <w:r>
+        <w:rPr>
+          <w:sz w:val="40"/>
+          <w:szCs w:val="40"/>
+        </w:rPr>
+        <w:t xml:space="preserve"> is </w:t>
+      </w:r>
+      <w:r>
+        <w:rPr>
+          <w:b/>
+          <w:sz w:val="40"/>
+          <w:szCs w:val="40"/>
+        </w:rPr>
+        <w:t>final</w:t>
+      </w:r>
+      <w:r>
+        <w:rPr>
+          <w:b/>
+          <w:sz w:val="40"/>
+          <w:szCs w:val="40"/>
+        </w:rPr>
+        <w:t xml:space="preserve"> + </w:t>
+      </w:r>
+      <w:r>
+        <w:rPr>
+          <w:sz w:val="40"/>
+          <w:szCs w:val="40"/>
+        </w:rPr>
+        <w:t xml:space="preserve">Can’t override </w:t>
+      </w:r>
+      <w:r>
+        <w:rPr>
+          <w:b/>
+          <w:sz w:val="40"/>
+          <w:szCs w:val="40"/>
+        </w:rPr>
+        <w:t>clone()</w:t>
+      </w:r>
+      <w:r>
+        <w:rPr>
+          <w:sz w:val="40"/>
+          <w:szCs w:val="40"/>
+        </w:rPr>
+        <w:t xml:space="preserve">. The </w:t>
+      </w:r>
+      <w:proofErr w:type="spellStart"/>
+      <w:r>
+        <w:rPr>
+          <w:sz w:val="40"/>
+          <w:szCs w:val="40"/>
+        </w:rPr>
+        <w:t>enum</w:t>
+      </w:r>
+      <w:proofErr w:type="spellEnd"/>
+      <w:r>
+        <w:rPr>
+          <w:sz w:val="40"/>
+          <w:szCs w:val="40"/>
+        </w:rPr>
+        <w:t xml:space="preserve"> </w:t>
+      </w:r>
+      <w:r>
+        <w:rPr>
+          <w:b/>
+          <w:sz w:val="40"/>
+          <w:szCs w:val="40"/>
+        </w:rPr>
+        <w:t>values</w:t>
+      </w:r>
+      <w:r>
+        <w:rPr>
+          <w:sz w:val="40"/>
+          <w:szCs w:val="40"/>
+        </w:rPr>
+        <w:t xml:space="preserve"> can be the </w:t>
+      </w:r>
+      <w:r>
+        <w:rPr>
+          <w:b/>
+          <w:sz w:val="40"/>
+          <w:szCs w:val="40"/>
+        </w:rPr>
+        <w:t>same</w:t>
+      </w:r>
+      <w:r>
+        <w:rPr>
+          <w:b/>
+          <w:sz w:val="40"/>
+          <w:szCs w:val="40"/>
+        </w:rPr>
+        <w:t xml:space="preserve"> </w:t>
+      </w:r>
+      <w:r>
+        <w:rPr>
+          <w:sz w:val="40"/>
+          <w:szCs w:val="40"/>
+        </w:rPr>
+        <w:t>(MS1(“Ms.”), MS2(“Ms.”))</w:t>
+      </w:r>
+    </w:p>
+    <w:p>
+      <w:pPr>
+        <w:rPr>
+          <w:sz w:val="40"/>
+          <w:szCs w:val="40"/>
+        </w:rPr>
+      </w:pPr>
+      <w:r>
+        <w:rPr>
+          <w:sz w:val="40"/>
+          <w:szCs w:val="40"/>
+        </w:rPr>
         <w:t>-</w:t>
       </w:r>
       <w:proofErr w:type="spellStart"/>
@@ -6451,7 +6481,7 @@
           <w:sz w:val="40"/>
           <w:szCs w:val="40"/>
         </w:rPr>
-        <w:t>Enum</w:t>
+        <w:t>enums</w:t>
       </w:r>
       <w:proofErr w:type="spellEnd"/>
       <w:r>
@@ -6459,15 +6489,173 @@
           <w:sz w:val="40"/>
           <w:szCs w:val="40"/>
         </w:rPr>
-        <w:t xml:space="preserve"> type is a data type that enables for a variable to be a set of predefined </w:t>
-      </w:r>
-      <w:proofErr w:type="gramStart"/>
+        <w:t xml:space="preserve"> implicitly extend </w:t>
+      </w:r>
+      <w:proofErr w:type="spellStart"/>
       <w:r>
         <w:rPr>
           <w:b/>
           <w:sz w:val="40"/>
           <w:szCs w:val="40"/>
         </w:rPr>
+        <w:t>java.lang.Enum</w:t>
+      </w:r>
+      <w:proofErr w:type="spellEnd"/>
+      <w:r>
+        <w:rPr>
+          <w:sz w:val="40"/>
+          <w:szCs w:val="40"/>
+        </w:rPr>
+        <w:t xml:space="preserve"> -&gt; </w:t>
+      </w:r>
+      <w:r>
+        <w:rPr>
+          <w:b/>
+          <w:sz w:val="40"/>
+          <w:szCs w:val="40"/>
+        </w:rPr>
+        <w:t>cant extend</w:t>
+      </w:r>
+      <w:r>
+        <w:rPr>
+          <w:sz w:val="40"/>
+          <w:szCs w:val="40"/>
+        </w:rPr>
+        <w:t xml:space="preserve"> anything else</w:t>
+      </w:r>
+    </w:p>
+    <w:p>
+      <w:pPr>
+        <w:rPr>
+          <w:sz w:val="40"/>
+          <w:szCs w:val="40"/>
+        </w:rPr>
+      </w:pPr>
+      <w:r>
+        <w:rPr>
+          <w:sz w:val="40"/>
+          <w:szCs w:val="40"/>
+        </w:rPr>
+        <w:t>-</w:t>
+      </w:r>
+      <w:proofErr w:type="spellStart"/>
+      <w:r>
+        <w:rPr>
+          <w:sz w:val="40"/>
+          <w:szCs w:val="40"/>
+        </w:rPr>
+        <w:t>enum</w:t>
+      </w:r>
+      <w:proofErr w:type="spellEnd"/>
+      <w:r>
+        <w:rPr>
+          <w:sz w:val="40"/>
+          <w:szCs w:val="40"/>
+        </w:rPr>
+        <w:t xml:space="preserve"> defines a class (</w:t>
+      </w:r>
+      <w:proofErr w:type="spellStart"/>
+      <w:r>
+        <w:rPr>
+          <w:sz w:val="40"/>
+          <w:szCs w:val="40"/>
+        </w:rPr>
+        <w:t>enum</w:t>
+      </w:r>
+      <w:proofErr w:type="spellEnd"/>
+      <w:r>
+        <w:rPr>
+          <w:sz w:val="40"/>
+          <w:szCs w:val="40"/>
+        </w:rPr>
+        <w:t xml:space="preserve"> type). The </w:t>
+      </w:r>
+      <w:proofErr w:type="spellStart"/>
+      <w:r>
+        <w:rPr>
+          <w:sz w:val="40"/>
+          <w:szCs w:val="40"/>
+        </w:rPr>
+        <w:t>enum</w:t>
+      </w:r>
+      <w:proofErr w:type="spellEnd"/>
+      <w:r>
+        <w:rPr>
+          <w:sz w:val="40"/>
+          <w:szCs w:val="40"/>
+        </w:rPr>
+        <w:t xml:space="preserve"> body can include methods and other fields. The compiler automatically adds special methods: static </w:t>
+      </w:r>
+      <w:r>
+        <w:rPr>
+          <w:b/>
+          <w:sz w:val="40"/>
+          <w:szCs w:val="40"/>
+        </w:rPr>
+        <w:t>values()</w:t>
+      </w:r>
+      <w:r>
+        <w:rPr>
+          <w:sz w:val="40"/>
+          <w:szCs w:val="40"/>
+        </w:rPr>
+        <w:t xml:space="preserve"> and </w:t>
+      </w:r>
+      <w:proofErr w:type="spellStart"/>
+      <w:r>
+        <w:rPr>
+          <w:b/>
+          <w:sz w:val="40"/>
+          <w:szCs w:val="40"/>
+        </w:rPr>
+        <w:t>valueOf</w:t>
+      </w:r>
+      <w:proofErr w:type="spellEnd"/>
+      <w:r>
+        <w:rPr>
+          <w:b/>
+          <w:sz w:val="40"/>
+          <w:szCs w:val="40"/>
+        </w:rPr>
+        <w:t>()</w:t>
+      </w:r>
+      <w:r>
+        <w:rPr>
+          <w:b/>
+          <w:sz w:val="40"/>
+          <w:szCs w:val="40"/>
+        </w:rPr>
+        <w:t xml:space="preserve">, </w:t>
+      </w:r>
+      <w:r>
+        <w:rPr>
+          <w:b/>
+          <w:sz w:val="40"/>
+          <w:szCs w:val="40"/>
+        </w:rPr>
+        <w:t xml:space="preserve">ordinal() name(). </w:t>
+      </w:r>
+    </w:p>
+    <w:p>
+      <w:pPr>
+        <w:rPr>
+          <w:sz w:val="40"/>
+          <w:szCs w:val="40"/>
+        </w:rPr>
+      </w:pPr>
+      <w:r>
+        <w:rPr>
+          <w:sz w:val="40"/>
+          <w:szCs w:val="40"/>
+        </w:rPr>
+        <w:t xml:space="preserve">-The </w:t>
+      </w:r>
+      <w:r>
+        <w:rPr>
+          <w:b/>
+          <w:sz w:val="40"/>
+          <w:szCs w:val="40"/>
+        </w:rPr>
         <w:t>constants</w:t>
       </w:r>
       <w:r>
@@ -6475,15 +6663,37 @@
           <w:sz w:val="40"/>
           <w:szCs w:val="40"/>
         </w:rPr>
-        <w:t>.-</w:t>
-      </w:r>
-      <w:proofErr w:type="gramEnd"/>
-      <w:r>
-        <w:rPr>
-          <w:sz w:val="40"/>
-          <w:szCs w:val="40"/>
-        </w:rPr>
-        <w:t xml:space="preserve">&gt; </w:t>
+        <w:t xml:space="preserve"> are defined 1</w:t>
+      </w:r>
+      <w:r>
+        <w:rPr>
+          <w:sz w:val="40"/>
+          <w:szCs w:val="40"/>
+          <w:vertAlign w:val="superscript"/>
+        </w:rPr>
+        <w:t>st</w:t>
+      </w:r>
+      <w:r>
+        <w:rPr>
+          <w:sz w:val="40"/>
+          <w:szCs w:val="40"/>
+        </w:rPr>
+        <w:t>, then fields + methods.</w:t>
+      </w:r>
+    </w:p>
+    <w:p>
+      <w:pPr>
+        <w:rPr>
+          <w:sz w:val="40"/>
+          <w:szCs w:val="40"/>
+        </w:rPr>
+      </w:pPr>
+      <w:r>
+        <w:rPr>
+          <w:sz w:val="40"/>
+          <w:szCs w:val="40"/>
+        </w:rPr>
+        <w:t xml:space="preserve">-The </w:t>
       </w:r>
       <w:proofErr w:type="spellStart"/>
       <w:r>
@@ -6499,7 +6709,7 @@
           <w:sz w:val="40"/>
           <w:szCs w:val="40"/>
         </w:rPr>
-        <w:t xml:space="preserve"> is </w:t>
+        <w:t xml:space="preserve"> constructor must be </w:t>
       </w:r>
       <w:r>
         <w:rPr>
@@ -6507,7 +6717,14 @@
           <w:sz w:val="40"/>
           <w:szCs w:val="40"/>
         </w:rPr>
-        <w:t>final</w:t>
+        <w:t>package</w:t>
+      </w:r>
+      <w:r>
+        <w:rPr>
+          <w:sz w:val="40"/>
+          <w:szCs w:val="40"/>
+        </w:rPr>
+        <w:t xml:space="preserve"> or </w:t>
       </w:r>
       <w:r>
         <w:rPr>
@@ -6515,39 +6732,39 @@
           <w:sz w:val="40"/>
           <w:szCs w:val="40"/>
         </w:rPr>
-        <w:t xml:space="preserve"> + </w:t>
-      </w:r>
-      <w:r>
-        <w:rPr>
-          <w:sz w:val="40"/>
-          <w:szCs w:val="40"/>
-        </w:rPr>
-        <w:t xml:space="preserve">Can’t override </w:t>
-      </w:r>
+        <w:t>private</w:t>
+      </w:r>
+      <w:r>
+        <w:rPr>
+          <w:sz w:val="40"/>
+          <w:szCs w:val="40"/>
+        </w:rPr>
+        <w:t xml:space="preserve"> access. </w:t>
+      </w:r>
+    </w:p>
+    <w:p>
+      <w:pPr>
+        <w:rPr>
+          <w:sz w:val="40"/>
+          <w:szCs w:val="40"/>
+        </w:rPr>
+      </w:pPr>
       <w:r>
         <w:rPr>
           <w:b/>
           <w:sz w:val="40"/>
           <w:szCs w:val="40"/>
         </w:rPr>
-        <w:t>clone()</w:t>
-      </w:r>
-      <w:r>
-        <w:rPr>
-          <w:sz w:val="40"/>
-          <w:szCs w:val="40"/>
-        </w:rPr>
-        <w:t xml:space="preserve">. The </w:t>
-      </w:r>
-      <w:proofErr w:type="spellStart"/>
-      <w:r>
-        <w:rPr>
-          <w:sz w:val="40"/>
-          <w:szCs w:val="40"/>
-        </w:rPr>
-        <w:t>enum</w:t>
-      </w:r>
-      <w:proofErr w:type="spellEnd"/>
+        <w:t>-</w:t>
+      </w:r>
+      <w:r>
+        <w:rPr>
+          <w:b/>
+          <w:sz w:val="40"/>
+          <w:szCs w:val="40"/>
+        </w:rPr>
+        <w:t>Can’t access</w:t>
+      </w:r>
       <w:r>
         <w:rPr>
           <w:sz w:val="40"/>
@@ -6561,14 +6778,14 @@
           <w:sz w:val="40"/>
           <w:szCs w:val="40"/>
         </w:rPr>
-        <w:t>values</w:t>
-      </w:r>
-      <w:r>
-        <w:rPr>
-          <w:sz w:val="40"/>
-          <w:szCs w:val="40"/>
-        </w:rPr>
-        <w:t xml:space="preserve"> can be the </w:t>
+        <w:t>non-final static field</w:t>
+      </w:r>
+      <w:r>
+        <w:rPr>
+          <w:sz w:val="40"/>
+          <w:szCs w:val="40"/>
+        </w:rPr>
+        <w:t xml:space="preserve"> in </w:t>
       </w:r>
       <w:r>
         <w:rPr>
@@ -6576,434 +6793,30 @@
           <w:sz w:val="40"/>
           <w:szCs w:val="40"/>
         </w:rPr>
-        <w:t>same</w:t>
-      </w:r>
-      <w:r>
+        <w:t>constructor</w:t>
+      </w:r>
+      <w:r>
+        <w:rPr>
+          <w:sz w:val="40"/>
+          <w:szCs w:val="40"/>
+        </w:rPr>
+        <w:t>.</w:t>
+      </w:r>
+    </w:p>
+    <w:p>
+      <w:pPr>
         <w:rPr>
           <w:b/>
           <w:sz w:val="40"/>
           <w:szCs w:val="40"/>
         </w:rPr>
-        <w:t xml:space="preserve"> </w:t>
-      </w:r>
-      <w:r>
-        <w:rPr>
-          <w:sz w:val="40"/>
-          <w:szCs w:val="40"/>
-        </w:rPr>
-        <w:t>(MS1(“Ms.”), MS2(“Ms.”))</w:t>
-      </w:r>
-    </w:p>
-    <w:p>
-      <w:pPr>
-        <w:rPr>
-          <w:sz w:val="40"/>
-          <w:szCs w:val="40"/>
-        </w:rPr>
-      </w:pPr>
-      <w:r>
-        <w:rPr>
-          <w:sz w:val="40"/>
-          <w:szCs w:val="40"/>
-        </w:rPr>
-        <w:t>-</w:t>
-      </w:r>
-      <w:proofErr w:type="spellStart"/>
-      <w:r>
-        <w:rPr>
-          <w:sz w:val="40"/>
-          <w:szCs w:val="40"/>
-        </w:rPr>
-        <w:t>enums</w:t>
-      </w:r>
-      <w:proofErr w:type="spellEnd"/>
-      <w:r>
-        <w:rPr>
-          <w:sz w:val="40"/>
-          <w:szCs w:val="40"/>
-        </w:rPr>
-        <w:t xml:space="preserve"> implicitly extend </w:t>
-      </w:r>
-      <w:proofErr w:type="spellStart"/>
-      <w:proofErr w:type="gramStart"/>
-      <w:r>
-        <w:rPr>
-          <w:b/>
-          <w:sz w:val="40"/>
-          <w:szCs w:val="40"/>
-        </w:rPr>
-        <w:t>java.lan</w:t>
-      </w:r>
-      <w:bookmarkStart w:id="0" w:name="_GoBack"/>
-      <w:bookmarkEnd w:id="0"/>
-      <w:r>
-        <w:rPr>
-          <w:b/>
-          <w:sz w:val="40"/>
-          <w:szCs w:val="40"/>
-        </w:rPr>
-        <w:t>g</w:t>
-      </w:r>
-      <w:proofErr w:type="gramEnd"/>
-      <w:r>
-        <w:rPr>
-          <w:b/>
-          <w:sz w:val="40"/>
-          <w:szCs w:val="40"/>
-        </w:rPr>
-        <w:t>.En</w:t>
-      </w:r>
-      <w:r>
-        <w:rPr>
-          <w:b/>
-          <w:sz w:val="40"/>
-          <w:szCs w:val="40"/>
-        </w:rPr>
-        <w:t>um</w:t>
-      </w:r>
-      <w:proofErr w:type="spellEnd"/>
-      <w:r>
-        <w:rPr>
-          <w:sz w:val="40"/>
-          <w:szCs w:val="40"/>
-        </w:rPr>
-        <w:t xml:space="preserve"> -&gt; </w:t>
-      </w:r>
-      <w:r>
-        <w:rPr>
-          <w:b/>
-          <w:sz w:val="40"/>
-          <w:szCs w:val="40"/>
-        </w:rPr>
-        <w:t>cant extend</w:t>
-      </w:r>
-      <w:r>
-        <w:rPr>
-          <w:sz w:val="40"/>
-          <w:szCs w:val="40"/>
-        </w:rPr>
-        <w:t xml:space="preserve"> anything else</w:t>
-      </w:r>
-    </w:p>
-    <w:p>
-      <w:pPr>
-        <w:rPr>
-          <w:sz w:val="40"/>
-          <w:szCs w:val="40"/>
-        </w:rPr>
-      </w:pPr>
-      <w:r>
-        <w:rPr>
-          <w:sz w:val="40"/>
-          <w:szCs w:val="40"/>
-        </w:rPr>
-        <w:t>-</w:t>
-      </w:r>
-      <w:proofErr w:type="spellStart"/>
-      <w:r>
-        <w:rPr>
-          <w:sz w:val="40"/>
-          <w:szCs w:val="40"/>
-        </w:rPr>
-        <w:t>enum</w:t>
-      </w:r>
-      <w:proofErr w:type="spellEnd"/>
-      <w:r>
-        <w:rPr>
-          <w:sz w:val="40"/>
-          <w:szCs w:val="40"/>
-        </w:rPr>
-        <w:t xml:space="preserve"> defines a class (</w:t>
-      </w:r>
-      <w:proofErr w:type="spellStart"/>
-      <w:r>
-        <w:rPr>
-          <w:sz w:val="40"/>
-          <w:szCs w:val="40"/>
-        </w:rPr>
-        <w:t>enum</w:t>
-      </w:r>
-      <w:proofErr w:type="spellEnd"/>
-      <w:r>
-        <w:rPr>
-          <w:sz w:val="40"/>
-          <w:szCs w:val="40"/>
-        </w:rPr>
-        <w:t xml:space="preserve"> type). The </w:t>
-      </w:r>
-      <w:proofErr w:type="spellStart"/>
-      <w:r>
-        <w:rPr>
-          <w:sz w:val="40"/>
-          <w:szCs w:val="40"/>
-        </w:rPr>
-        <w:t>enum</w:t>
-      </w:r>
-      <w:proofErr w:type="spellEnd"/>
-      <w:r>
-        <w:rPr>
-          <w:sz w:val="40"/>
-          <w:szCs w:val="40"/>
-        </w:rPr>
-        <w:t xml:space="preserve"> body can include methods and other fields. The compiler automatically adds special methods: static </w:t>
-      </w:r>
-      <w:proofErr w:type="gramStart"/>
-      <w:r>
-        <w:rPr>
-          <w:b/>
-          <w:sz w:val="40"/>
-          <w:szCs w:val="40"/>
-        </w:rPr>
-        <w:t>values(</w:t>
-      </w:r>
-      <w:proofErr w:type="gramEnd"/>
-      <w:r>
-        <w:rPr>
-          <w:b/>
-          <w:sz w:val="40"/>
-          <w:szCs w:val="40"/>
-        </w:rPr>
-        <w:t>)</w:t>
-      </w:r>
-      <w:r>
-        <w:rPr>
-          <w:sz w:val="40"/>
-          <w:szCs w:val="40"/>
-        </w:rPr>
-        <w:t xml:space="preserve"> and </w:t>
-      </w:r>
-      <w:proofErr w:type="spellStart"/>
-      <w:r>
-        <w:rPr>
-          <w:b/>
-          <w:sz w:val="40"/>
-          <w:szCs w:val="40"/>
-        </w:rPr>
-        <w:t>valueOf</w:t>
-      </w:r>
-      <w:proofErr w:type="spellEnd"/>
-      <w:r>
-        <w:rPr>
-          <w:b/>
-          <w:sz w:val="40"/>
-          <w:szCs w:val="40"/>
-        </w:rPr>
-        <w:t>()</w:t>
-      </w:r>
-      <w:r>
-        <w:rPr>
-          <w:b/>
-          <w:sz w:val="40"/>
-          <w:szCs w:val="40"/>
-        </w:rPr>
-        <w:t xml:space="preserve">, </w:t>
-      </w:r>
-      <w:r>
-        <w:rPr>
-          <w:b/>
-          <w:sz w:val="40"/>
-          <w:szCs w:val="40"/>
-        </w:rPr>
-        <w:t xml:space="preserve">ordinal() name(). </w:t>
-      </w:r>
-    </w:p>
-    <w:p>
-      <w:pPr>
-        <w:rPr>
-          <w:sz w:val="40"/>
-          <w:szCs w:val="40"/>
-        </w:rPr>
-      </w:pPr>
-      <w:r>
-        <w:rPr>
-          <w:sz w:val="40"/>
-          <w:szCs w:val="40"/>
-        </w:rPr>
-        <w:t xml:space="preserve">-The </w:t>
-      </w:r>
-      <w:r>
-        <w:rPr>
-          <w:b/>
-          <w:sz w:val="40"/>
-          <w:szCs w:val="40"/>
-        </w:rPr>
-        <w:t>constants</w:t>
-      </w:r>
-      <w:r>
-        <w:rPr>
-          <w:sz w:val="40"/>
-          <w:szCs w:val="40"/>
-        </w:rPr>
-        <w:t xml:space="preserve"> are defined 1</w:t>
-      </w:r>
-      <w:r>
-        <w:rPr>
-          <w:sz w:val="40"/>
-          <w:szCs w:val="40"/>
-          <w:vertAlign w:val="superscript"/>
-        </w:rPr>
-        <w:t>st</w:t>
-      </w:r>
-      <w:r>
-        <w:rPr>
-          <w:sz w:val="40"/>
-          <w:szCs w:val="40"/>
-        </w:rPr>
-        <w:t>, then fields + methods.</w:t>
-      </w:r>
-    </w:p>
-    <w:p>
-      <w:pPr>
-        <w:rPr>
-          <w:sz w:val="40"/>
-          <w:szCs w:val="40"/>
-        </w:rPr>
-      </w:pPr>
-      <w:r>
-        <w:rPr>
-          <w:sz w:val="40"/>
-          <w:szCs w:val="40"/>
-        </w:rPr>
-        <w:t xml:space="preserve">-The </w:t>
-      </w:r>
-      <w:proofErr w:type="spellStart"/>
-      <w:r>
-        <w:rPr>
-          <w:sz w:val="40"/>
-          <w:szCs w:val="40"/>
-        </w:rPr>
-        <w:t>enum</w:t>
-      </w:r>
-      <w:proofErr w:type="spellEnd"/>
-      <w:r>
-        <w:rPr>
-          <w:sz w:val="40"/>
-          <w:szCs w:val="40"/>
-        </w:rPr>
-        <w:t xml:space="preserve"> constructor must be </w:t>
-      </w:r>
-      <w:r>
-        <w:rPr>
-          <w:b/>
-          <w:sz w:val="40"/>
-          <w:szCs w:val="40"/>
-        </w:rPr>
-        <w:t>package</w:t>
-      </w:r>
-      <w:r>
-        <w:rPr>
-          <w:sz w:val="40"/>
-          <w:szCs w:val="40"/>
-        </w:rPr>
-        <w:t xml:space="preserve"> or </w:t>
-      </w:r>
-      <w:r>
-        <w:rPr>
-          <w:b/>
-          <w:sz w:val="40"/>
-          <w:szCs w:val="40"/>
-        </w:rPr>
-        <w:t>private</w:t>
-      </w:r>
-      <w:r>
-        <w:rPr>
-          <w:sz w:val="40"/>
-          <w:szCs w:val="40"/>
-        </w:rPr>
-        <w:t xml:space="preserve"> access. </w:t>
-      </w:r>
-    </w:p>
-    <w:p>
-      <w:pPr>
-        <w:rPr>
-          <w:sz w:val="40"/>
-          <w:szCs w:val="40"/>
-        </w:rPr>
-      </w:pPr>
-      <w:r>
-        <w:rPr>
-          <w:b/>
-          <w:sz w:val="40"/>
-          <w:szCs w:val="40"/>
-        </w:rPr>
-        <w:t>-</w:t>
-      </w:r>
-      <w:r>
-        <w:rPr>
-          <w:b/>
-          <w:sz w:val="40"/>
-          <w:szCs w:val="40"/>
-        </w:rPr>
-        <w:t>Can’t access</w:t>
-      </w:r>
-      <w:r>
-        <w:rPr>
-          <w:sz w:val="40"/>
-          <w:szCs w:val="40"/>
-        </w:rPr>
-        <w:t xml:space="preserve"> </w:t>
-      </w:r>
-      <w:r>
-        <w:rPr>
-          <w:b/>
-          <w:sz w:val="40"/>
-          <w:szCs w:val="40"/>
-        </w:rPr>
-        <w:t>non-final static field</w:t>
-      </w:r>
-      <w:r>
-        <w:rPr>
-          <w:sz w:val="40"/>
-          <w:szCs w:val="40"/>
-        </w:rPr>
-        <w:t xml:space="preserve"> in </w:t>
-      </w:r>
-      <w:r>
-        <w:rPr>
-          <w:b/>
-          <w:sz w:val="40"/>
-          <w:szCs w:val="40"/>
-        </w:rPr>
-        <w:t>constructor</w:t>
-      </w:r>
-      <w:r>
-        <w:rPr>
-          <w:sz w:val="40"/>
-          <w:szCs w:val="40"/>
-        </w:rPr>
-        <w:t>.</w:t>
-      </w:r>
-    </w:p>
-    <w:p>
-      <w:pPr>
-        <w:rPr>
-          <w:b/>
-          <w:sz w:val="40"/>
-          <w:szCs w:val="40"/>
-        </w:rPr>
-      </w:pPr>
-      <w:r>
-        <w:rPr>
-          <w:sz w:val="40"/>
-          <w:szCs w:val="40"/>
-        </w:rPr>
-        <w:t>-</w:t>
-      </w:r>
-      <w:proofErr w:type="spellStart"/>
-      <w:r>
-        <w:rPr>
-          <w:sz w:val="40"/>
-          <w:szCs w:val="40"/>
-        </w:rPr>
-        <w:t>Enums</w:t>
-      </w:r>
-      <w:proofErr w:type="spellEnd"/>
-      <w:r>
-        <w:rPr>
-          <w:sz w:val="40"/>
-          <w:szCs w:val="40"/>
-        </w:rPr>
-        <w:t xml:space="preserve"> implement </w:t>
+      </w:pPr>
+      <w:r>
+        <w:rPr>
+          <w:sz w:val="40"/>
+          <w:szCs w:val="40"/>
+        </w:rPr>
+        <w:t xml:space="preserve">-Enums implement </w:t>
       </w:r>
       <w:r>
         <w:rPr>
@@ -7073,6 +6886,53 @@
           <w:sz w:val="40"/>
           <w:szCs w:val="40"/>
         </w:rPr>
+        <w:t>-</w:t>
+      </w:r>
+      <w:r>
+        <w:rPr>
+          <w:b/>
+          <w:bCs/>
+          <w:sz w:val="40"/>
+          <w:szCs w:val="40"/>
+        </w:rPr>
+        <w:t>reflection library</w:t>
+      </w:r>
+      <w:r>
+        <w:rPr>
+          <w:sz w:val="40"/>
+          <w:szCs w:val="40"/>
+        </w:rPr>
+        <w:t xml:space="preserve">: toolset to write programs that manipulates code </w:t>
+      </w:r>
+      <w:r>
+        <w:rPr>
+          <w:b/>
+          <w:bCs/>
+          <w:sz w:val="40"/>
+          <w:szCs w:val="40"/>
+        </w:rPr>
+        <w:t>dynamically</w:t>
+      </w:r>
+      <w:r>
+        <w:rPr>
+          <w:sz w:val="40"/>
+          <w:szCs w:val="40"/>
+        </w:rPr>
+        <w:t>. It supports UI builders, object-relational mappers and development tools that dynamically inquire about capabilities of classes.</w:t>
+      </w:r>
+    </w:p>
+    <w:p>
+      <w:pPr>
+        <w:rPr>
+          <w:sz w:val="40"/>
+          <w:szCs w:val="40"/>
+        </w:rPr>
+      </w:pPr>
+      <w:r>
+        <w:rPr>
+          <w:sz w:val="40"/>
+          <w:szCs w:val="40"/>
+        </w:rPr>
         <w:t xml:space="preserve">-A </w:t>
       </w:r>
       <w:r>
@@ -7089,103 +6949,103 @@
           <w:sz w:val="40"/>
           <w:szCs w:val="40"/>
         </w:rPr>
-        <w:t xml:space="preserve">program can analyze the capabilities of classes. The </w:t>
+        <w:t xml:space="preserve">program can analyze the capabilities of classes. </w:t>
+      </w:r>
+    </w:p>
+    <w:p>
+      <w:pPr>
+        <w:pStyle w:val="Heading2"/>
+        <w:rPr>
+          <w:color w:val="FF0000"/>
+          <w:sz w:val="40"/>
+          <w:szCs w:val="40"/>
+        </w:rPr>
+      </w:pPr>
+      <w:r>
+        <w:rPr>
+          <w:color w:val="FF0000"/>
+          <w:sz w:val="40"/>
+          <w:szCs w:val="40"/>
+        </w:rPr>
+        <w:t xml:space="preserve">5.7.1 The Class </w:t>
+      </w:r>
+      <w:proofErr w:type="spellStart"/>
+      <w:r>
+        <w:rPr>
+          <w:color w:val="FF0000"/>
+          <w:sz w:val="40"/>
+          <w:szCs w:val="40"/>
+        </w:rPr>
+        <w:t>Class</w:t>
+      </w:r>
+      <w:proofErr w:type="spellEnd"/>
+    </w:p>
+    <w:p>
+      <w:pPr>
+        <w:rPr>
+          <w:sz w:val="40"/>
+          <w:szCs w:val="40"/>
+        </w:rPr>
+      </w:pPr>
+      <w:r>
+        <w:rPr>
+          <w:sz w:val="40"/>
+          <w:szCs w:val="40"/>
+        </w:rPr>
+        <w:t>-</w:t>
+      </w:r>
+      <w:r>
+        <w:rPr>
+          <w:i/>
+          <w:sz w:val="40"/>
+          <w:szCs w:val="40"/>
+        </w:rPr>
+        <w:t>runtime type identification</w:t>
+      </w:r>
+      <w:r>
+        <w:rPr>
+          <w:sz w:val="40"/>
+          <w:szCs w:val="40"/>
+        </w:rPr>
+        <w:t>: used by JVM to keep track of the class which each object belongs.</w:t>
+      </w:r>
+      <w:r>
+        <w:rPr>
+          <w:sz w:val="40"/>
+          <w:szCs w:val="40"/>
+        </w:rPr>
+        <w:t xml:space="preserve"> Runtime type info used by VM to select correct method to execute.</w:t>
+      </w:r>
+    </w:p>
+    <w:p>
+      <w:pPr>
+        <w:rPr>
+          <w:sz w:val="40"/>
+          <w:szCs w:val="40"/>
+        </w:rPr>
+      </w:pPr>
+      <w:r>
+        <w:rPr>
+          <w:sz w:val="40"/>
+          <w:szCs w:val="40"/>
+        </w:rPr>
+        <w:t xml:space="preserve">-We can also access this info by </w:t>
       </w:r>
       <w:r>
         <w:rPr>
           <w:b/>
-          <w:sz w:val="40"/>
-          <w:szCs w:val="40"/>
-        </w:rPr>
-        <w:t>reflection library</w:t>
-      </w:r>
-      <w:r>
-        <w:rPr>
-          <w:i/>
+          <w:bCs/>
+          <w:sz w:val="40"/>
+          <w:szCs w:val="40"/>
+        </w:rPr>
+        <w:t>Class</w:t>
+      </w:r>
+      <w:r>
+        <w:rPr>
           <w:sz w:val="40"/>
           <w:szCs w:val="40"/>
         </w:rPr>
         <w:t xml:space="preserve"> </w:t>
-      </w:r>
-      <w:r>
-        <w:rPr>
-          <w:sz w:val="40"/>
-          <w:szCs w:val="40"/>
-        </w:rPr>
-        <w:t>give a toolset to support UI builders, object-relational mappers to inquire the capabilities of classes.</w:t>
-      </w:r>
-    </w:p>
-    <w:p>
-      <w:pPr>
-        <w:pStyle w:val="Heading2"/>
-        <w:rPr>
-          <w:color w:val="FF0000"/>
-          <w:sz w:val="40"/>
-          <w:szCs w:val="40"/>
-        </w:rPr>
-      </w:pPr>
-      <w:r>
-        <w:rPr>
-          <w:color w:val="FF0000"/>
-          <w:sz w:val="40"/>
-          <w:szCs w:val="40"/>
-        </w:rPr>
-        <w:t xml:space="preserve">5.7.1 The Class </w:t>
-      </w:r>
-      <w:proofErr w:type="spellStart"/>
-      <w:r>
-        <w:rPr>
-          <w:color w:val="FF0000"/>
-          <w:sz w:val="40"/>
-          <w:szCs w:val="40"/>
-        </w:rPr>
-        <w:t>Class</w:t>
-      </w:r>
-      <w:proofErr w:type="spellEnd"/>
-    </w:p>
-    <w:p>
-      <w:pPr>
-        <w:rPr>
-          <w:sz w:val="40"/>
-          <w:szCs w:val="40"/>
-        </w:rPr>
-      </w:pPr>
-      <w:r>
-        <w:rPr>
-          <w:sz w:val="40"/>
-          <w:szCs w:val="40"/>
-        </w:rPr>
-        <w:t>-</w:t>
-      </w:r>
-      <w:r>
-        <w:rPr>
-          <w:i/>
-          <w:sz w:val="40"/>
-          <w:szCs w:val="40"/>
-        </w:rPr>
-        <w:t>runtime type identification</w:t>
-      </w:r>
-      <w:r>
-        <w:rPr>
-          <w:sz w:val="40"/>
-          <w:szCs w:val="40"/>
-        </w:rPr>
-        <w:t>: used by JVM to keep track of the class which each object belongs.</w:t>
-      </w:r>
-    </w:p>
-    <w:p>
-      <w:pPr>
-        <w:rPr>
-          <w:sz w:val="40"/>
-          <w:szCs w:val="40"/>
-        </w:rPr>
-      </w:pPr>
-      <w:r>
-        <w:rPr>
-          <w:sz w:val="40"/>
-          <w:szCs w:val="40"/>
-        </w:rPr>
-        <w:t xml:space="preserve">-We can also access this info by Class </w:t>
       </w:r>
       <w:proofErr w:type="spellStart"/>
       <w:r>
@@ -7260,9 +7120,9 @@
           <w:szCs w:val="40"/>
         </w:rPr>
         <w:drawing>
-          <wp:inline distT="0" distB="0" distL="0" distR="0" wp14:anchorId="35A5E4AD" wp14:editId="7A53B49C">
-            <wp:extent cx="5926453" cy="395097"/>
-            <wp:effectExtent l="0" t="0" r="0" b="5080"/>
+          <wp:inline distT="0" distB="0" distL="0" distR="0" wp14:anchorId="35A5E4AD" wp14:editId="2828E9E6">
+            <wp:extent cx="4959706" cy="330647"/>
+            <wp:effectExtent l="0" t="0" r="0" b="0"/>
             <wp:docPr id="69" name="Picture 69"/>
             <wp:cNvGraphicFramePr>
               <a:graphicFrameLocks xmlns:a="http://schemas.openxmlformats.org/drawingml/2006/main" noChangeAspect="1"/>
@@ -7283,7 +7143,7 @@
                   <pic:spPr>
                     <a:xfrm>
                       <a:off x="0" y="0"/>
-                      <a:ext cx="5979600" cy="398640"/>
+                      <a:ext cx="5021394" cy="334760"/>
                     </a:xfrm>
                     <a:prstGeom prst="rect">
                       <a:avLst/>
@@ -7308,7 +7168,55 @@
           <w:sz w:val="40"/>
           <w:szCs w:val="40"/>
         </w:rPr>
-        <w:t>-Obtain a Class object corresponding to a class name:</w:t>
+        <w:t>-</w:t>
+      </w:r>
+      <w:r>
+        <w:rPr>
+          <w:b/>
+          <w:bCs/>
+          <w:sz w:val="40"/>
+          <w:szCs w:val="40"/>
+        </w:rPr>
+        <w:t>Obtain</w:t>
+      </w:r>
+      <w:r>
+        <w:rPr>
+          <w:sz w:val="40"/>
+          <w:szCs w:val="40"/>
+        </w:rPr>
+        <w:t xml:space="preserve"> a </w:t>
+      </w:r>
+      <w:r>
+        <w:rPr>
+          <w:b/>
+          <w:bCs/>
+          <w:sz w:val="40"/>
+          <w:szCs w:val="40"/>
+        </w:rPr>
+        <w:t>Class</w:t>
+      </w:r>
+      <w:r>
+        <w:rPr>
+          <w:sz w:val="40"/>
+          <w:szCs w:val="40"/>
+        </w:rPr>
+        <w:t xml:space="preserve"> object corresponding to a </w:t>
+      </w:r>
+      <w:r>
+        <w:rPr>
+          <w:b/>
+          <w:bCs/>
+          <w:sz w:val="40"/>
+          <w:szCs w:val="40"/>
+        </w:rPr>
+        <w:t>class name</w:t>
+      </w:r>
+      <w:r>
+        <w:rPr>
+          <w:sz w:val="40"/>
+          <w:szCs w:val="40"/>
+        </w:rPr>
+        <w:t>:</w:t>
       </w:r>
     </w:p>
     <w:p>
@@ -7373,39 +7281,30 @@
           <w:sz w:val="40"/>
           <w:szCs w:val="40"/>
         </w:rPr>
-        <w:t xml:space="preserve">-If T is any Java </w:t>
-      </w:r>
-      <w:proofErr w:type="gramStart"/>
-      <w:r>
-        <w:rPr>
-          <w:sz w:val="40"/>
-          <w:szCs w:val="40"/>
-        </w:rPr>
-        <w:t xml:space="preserve">type,  </w:t>
-      </w:r>
-      <w:proofErr w:type="spellStart"/>
-      <w:r>
-        <w:rPr>
-          <w:sz w:val="40"/>
-          <w:szCs w:val="40"/>
-        </w:rPr>
-        <w:t>T</w:t>
-      </w:r>
-      <w:proofErr w:type="gramEnd"/>
-      <w:r>
-        <w:rPr>
-          <w:sz w:val="40"/>
-          <w:szCs w:val="40"/>
-        </w:rPr>
-        <w:t>.class</w:t>
-      </w:r>
-      <w:proofErr w:type="spellEnd"/>
-      <w:r>
-        <w:rPr>
-          <w:sz w:val="40"/>
-          <w:szCs w:val="40"/>
-        </w:rPr>
-        <w:t xml:space="preserve"> is the matching class object</w:t>
+        <w:t>+</w:t>
+      </w:r>
+      <w:r>
+        <w:rPr>
+          <w:b/>
+          <w:bCs/>
+          <w:sz w:val="40"/>
+          <w:szCs w:val="40"/>
+        </w:rPr>
+        <w:t>Tip</w:t>
+      </w:r>
+      <w:r>
+        <w:rPr>
+          <w:sz w:val="40"/>
+          <w:szCs w:val="40"/>
+        </w:rPr>
+        <w:t xml:space="preserve">: </w:t>
+      </w:r>
+      <w:r>
+        <w:rPr>
+          <w:sz w:val="40"/>
+          <w:szCs w:val="40"/>
+        </w:rPr>
+        <w:t>static loading and dynamic loading (Compiler vs Runtime)</w:t>
       </w:r>
     </w:p>
     <w:p>
@@ -7418,14 +7317,13 @@
       <w:r>
         <w:rPr>
           <w:noProof/>
-          <w:sz w:val="40"/>
-          <w:szCs w:val="40"/>
-        </w:rPr>
+        </w:rPr>
+        <w:lastRenderedPageBreak/>
         <w:drawing>
-          <wp:inline distT="0" distB="0" distL="0" distR="0" wp14:anchorId="7726111B" wp14:editId="4B71BCB3">
-            <wp:extent cx="3753196" cy="589788"/>
-            <wp:effectExtent l="0" t="0" r="0" b="1270"/>
-            <wp:docPr id="71" name="Picture 71"/>
+          <wp:inline distT="0" distB="0" distL="0" distR="0" wp14:anchorId="09FEC9DF" wp14:editId="44B5D6BD">
+            <wp:extent cx="4579315" cy="1186904"/>
+            <wp:effectExtent l="0" t="0" r="0" b="0"/>
+            <wp:docPr id="1696761341" name="Picture 1"/>
             <wp:cNvGraphicFramePr>
               <a:graphicFrameLocks xmlns:a="http://schemas.openxmlformats.org/drawingml/2006/main" noChangeAspect="1"/>
             </wp:cNvGraphicFramePr>
@@ -7433,7 +7331,7 @@
               <a:graphicData uri="http://schemas.openxmlformats.org/drawingml/2006/picture">
                 <pic:pic xmlns:pic="http://schemas.openxmlformats.org/drawingml/2006/picture">
                   <pic:nvPicPr>
-                    <pic:cNvPr id="1" name=""/>
+                    <pic:cNvPr id="1696761341" name=""/>
                     <pic:cNvPicPr/>
                   </pic:nvPicPr>
                   <pic:blipFill>
@@ -7445,7 +7343,7 @@
                   <pic:spPr>
                     <a:xfrm>
                       <a:off x="0" y="0"/>
-                      <a:ext cx="3802200" cy="597489"/>
+                      <a:ext cx="4593175" cy="1190496"/>
                     </a:xfrm>
                     <a:prstGeom prst="rect">
                       <a:avLst/>
@@ -7470,7 +7368,25 @@
           <w:sz w:val="40"/>
           <w:szCs w:val="40"/>
         </w:rPr>
-        <w:t>-The JVM manages a unique Class object for each type. You can use == to compare class objects:</w:t>
+        <w:t xml:space="preserve">-If T is any Java type,  </w:t>
+      </w:r>
+      <w:proofErr w:type="spellStart"/>
+      <w:r>
+        <w:rPr>
+          <w:b/>
+          <w:bCs/>
+          <w:sz w:val="40"/>
+          <w:szCs w:val="40"/>
+        </w:rPr>
+        <w:t>T.class</w:t>
+      </w:r>
+      <w:proofErr w:type="spellEnd"/>
+      <w:r>
+        <w:rPr>
+          <w:sz w:val="40"/>
+          <w:szCs w:val="40"/>
+        </w:rPr>
+        <w:t xml:space="preserve"> is the matching class object</w:t>
       </w:r>
     </w:p>
     <w:p>
@@ -7487,10 +7403,10 @@
           <w:szCs w:val="40"/>
         </w:rPr>
         <w:drawing>
-          <wp:inline distT="0" distB="0" distL="0" distR="0" wp14:anchorId="52501973" wp14:editId="59B35C99">
-            <wp:extent cx="3227830" cy="268986"/>
+          <wp:inline distT="0" distB="0" distL="0" distR="0" wp14:anchorId="7726111B" wp14:editId="7EDC0BD7">
+            <wp:extent cx="3035808" cy="477056"/>
             <wp:effectExtent l="0" t="0" r="0" b="0"/>
-            <wp:docPr id="73" name="Picture 73"/>
+            <wp:docPr id="71" name="Picture 71"/>
             <wp:cNvGraphicFramePr>
               <a:graphicFrameLocks xmlns:a="http://schemas.openxmlformats.org/drawingml/2006/main" noChangeAspect="1"/>
             </wp:cNvGraphicFramePr>
@@ -7510,6 +7426,277 @@
                   <pic:spPr>
                     <a:xfrm>
                       <a:off x="0" y="0"/>
+                      <a:ext cx="3098003" cy="486830"/>
+                    </a:xfrm>
+                    <a:prstGeom prst="rect">
+                      <a:avLst/>
+                    </a:prstGeom>
+                  </pic:spPr>
+                </pic:pic>
+              </a:graphicData>
+            </a:graphic>
+          </wp:inline>
+        </w:drawing>
+      </w:r>
+    </w:p>
+    <w:p>
+      <w:pPr>
+        <w:rPr>
+          <w:sz w:val="40"/>
+          <w:szCs w:val="40"/>
+        </w:rPr>
+      </w:pPr>
+      <w:r>
+        <w:rPr>
+          <w:sz w:val="40"/>
+          <w:szCs w:val="40"/>
+        </w:rPr>
+        <w:t>+</w:t>
+      </w:r>
+      <w:r>
+        <w:rPr>
+          <w:b/>
+          <w:bCs/>
+          <w:sz w:val="40"/>
+          <w:szCs w:val="40"/>
+        </w:rPr>
+        <w:t>Tip</w:t>
+      </w:r>
+      <w:r>
+        <w:rPr>
+          <w:sz w:val="40"/>
+          <w:szCs w:val="40"/>
+        </w:rPr>
+        <w:t>: Class is a generic class</w:t>
+      </w:r>
+    </w:p>
+    <w:p>
+      <w:pPr>
+        <w:rPr>
+          <w:sz w:val="40"/>
+          <w:szCs w:val="40"/>
+        </w:rPr>
+      </w:pPr>
+      <w:r>
+        <w:rPr>
+          <w:noProof/>
+        </w:rPr>
+        <w:drawing>
+          <wp:inline distT="0" distB="0" distL="0" distR="0" wp14:anchorId="4E555376" wp14:editId="1BF8FF6E">
+            <wp:extent cx="4294022" cy="785861"/>
+            <wp:effectExtent l="0" t="0" r="0" b="0"/>
+            <wp:docPr id="771735625" name="Picture 1"/>
+            <wp:cNvGraphicFramePr>
+              <a:graphicFrameLocks xmlns:a="http://schemas.openxmlformats.org/drawingml/2006/main" noChangeAspect="1"/>
+            </wp:cNvGraphicFramePr>
+            <a:graphic xmlns:a="http://schemas.openxmlformats.org/drawingml/2006/main">
+              <a:graphicData uri="http://schemas.openxmlformats.org/drawingml/2006/picture">
+                <pic:pic xmlns:pic="http://schemas.openxmlformats.org/drawingml/2006/picture">
+                  <pic:nvPicPr>
+                    <pic:cNvPr id="771735625" name=""/>
+                    <pic:cNvPicPr/>
+                  </pic:nvPicPr>
+                  <pic:blipFill>
+                    <a:blip r:embed="rId77"/>
+                    <a:stretch>
+                      <a:fillRect/>
+                    </a:stretch>
+                  </pic:blipFill>
+                  <pic:spPr>
+                    <a:xfrm>
+                      <a:off x="0" y="0"/>
+                      <a:ext cx="4326751" cy="791851"/>
+                    </a:xfrm>
+                    <a:prstGeom prst="rect">
+                      <a:avLst/>
+                    </a:prstGeom>
+                  </pic:spPr>
+                </pic:pic>
+              </a:graphicData>
+            </a:graphic>
+          </wp:inline>
+        </w:drawing>
+      </w:r>
+    </w:p>
+    <w:p>
+      <w:pPr>
+        <w:rPr>
+          <w:sz w:val="40"/>
+          <w:szCs w:val="40"/>
+        </w:rPr>
+      </w:pPr>
+      <w:r>
+        <w:rPr>
+          <w:sz w:val="40"/>
+          <w:szCs w:val="40"/>
+        </w:rPr>
+        <w:t>+</w:t>
+      </w:r>
+      <w:r>
+        <w:rPr>
+          <w:b/>
+          <w:bCs/>
+          <w:sz w:val="40"/>
+          <w:szCs w:val="40"/>
+        </w:rPr>
+        <w:t>Caution</w:t>
+      </w:r>
+      <w:r>
+        <w:rPr>
+          <w:sz w:val="40"/>
+          <w:szCs w:val="40"/>
+        </w:rPr>
+        <w:t>:</w:t>
+      </w:r>
+    </w:p>
+    <w:p>
+      <w:pPr>
+        <w:rPr>
+          <w:sz w:val="40"/>
+          <w:szCs w:val="40"/>
+        </w:rPr>
+      </w:pPr>
+      <w:r>
+        <w:rPr>
+          <w:noProof/>
+        </w:rPr>
+        <w:drawing>
+          <wp:inline distT="0" distB="0" distL="0" distR="0" wp14:anchorId="5612F45F" wp14:editId="67133E88">
+            <wp:extent cx="4433011" cy="798510"/>
+            <wp:effectExtent l="0" t="0" r="5715" b="1905"/>
+            <wp:docPr id="1885615089" name="Picture 1"/>
+            <wp:cNvGraphicFramePr>
+              <a:graphicFrameLocks xmlns:a="http://schemas.openxmlformats.org/drawingml/2006/main" noChangeAspect="1"/>
+            </wp:cNvGraphicFramePr>
+            <a:graphic xmlns:a="http://schemas.openxmlformats.org/drawingml/2006/main">
+              <a:graphicData uri="http://schemas.openxmlformats.org/drawingml/2006/picture">
+                <pic:pic xmlns:pic="http://schemas.openxmlformats.org/drawingml/2006/picture">
+                  <pic:nvPicPr>
+                    <pic:cNvPr id="1885615089" name=""/>
+                    <pic:cNvPicPr/>
+                  </pic:nvPicPr>
+                  <pic:blipFill>
+                    <a:blip r:embed="rId78"/>
+                    <a:stretch>
+                      <a:fillRect/>
+                    </a:stretch>
+                  </pic:blipFill>
+                  <pic:spPr>
+                    <a:xfrm>
+                      <a:off x="0" y="0"/>
+                      <a:ext cx="4449922" cy="801556"/>
+                    </a:xfrm>
+                    <a:prstGeom prst="rect">
+                      <a:avLst/>
+                    </a:prstGeom>
+                  </pic:spPr>
+                </pic:pic>
+              </a:graphicData>
+            </a:graphic>
+          </wp:inline>
+        </w:drawing>
+      </w:r>
+    </w:p>
+    <w:p>
+      <w:pPr>
+        <w:rPr>
+          <w:sz w:val="40"/>
+          <w:szCs w:val="40"/>
+        </w:rPr>
+      </w:pPr>
+      <w:r>
+        <w:rPr>
+          <w:sz w:val="40"/>
+          <w:szCs w:val="40"/>
+        </w:rPr>
+        <w:t xml:space="preserve">-The JVM manages a unique Class object for each type. You can use </w:t>
+      </w:r>
+      <w:r>
+        <w:rPr>
+          <w:b/>
+          <w:bCs/>
+          <w:sz w:val="40"/>
+          <w:szCs w:val="40"/>
+        </w:rPr>
+        <w:t>==</w:t>
+      </w:r>
+      <w:r>
+        <w:rPr>
+          <w:sz w:val="40"/>
+          <w:szCs w:val="40"/>
+        </w:rPr>
+        <w:t xml:space="preserve"> to </w:t>
+      </w:r>
+      <w:r>
+        <w:rPr>
+          <w:b/>
+          <w:bCs/>
+          <w:sz w:val="40"/>
+          <w:szCs w:val="40"/>
+        </w:rPr>
+        <w:t>compare</w:t>
+      </w:r>
+      <w:r>
+        <w:rPr>
+          <w:sz w:val="40"/>
+          <w:szCs w:val="40"/>
+        </w:rPr>
+        <w:t xml:space="preserve"> </w:t>
+      </w:r>
+      <w:r>
+        <w:rPr>
+          <w:b/>
+          <w:bCs/>
+          <w:sz w:val="40"/>
+          <w:szCs w:val="40"/>
+        </w:rPr>
+        <w:t>class objects</w:t>
+      </w:r>
+      <w:r>
+        <w:rPr>
+          <w:sz w:val="40"/>
+          <w:szCs w:val="40"/>
+        </w:rPr>
+        <w:t>:</w:t>
+      </w:r>
+    </w:p>
+    <w:p>
+      <w:pPr>
+        <w:rPr>
+          <w:sz w:val="40"/>
+          <w:szCs w:val="40"/>
+        </w:rPr>
+      </w:pPr>
+      <w:r>
+        <w:rPr>
+          <w:noProof/>
+          <w:sz w:val="40"/>
+          <w:szCs w:val="40"/>
+        </w:rPr>
+        <w:drawing>
+          <wp:inline distT="0" distB="0" distL="0" distR="0" wp14:anchorId="52501973" wp14:editId="59B35C99">
+            <wp:extent cx="3227830" cy="268986"/>
+            <wp:effectExtent l="0" t="0" r="0" b="0"/>
+            <wp:docPr id="73" name="Picture 73"/>
+            <wp:cNvGraphicFramePr>
+              <a:graphicFrameLocks xmlns:a="http://schemas.openxmlformats.org/drawingml/2006/main" noChangeAspect="1"/>
+            </wp:cNvGraphicFramePr>
+            <a:graphic xmlns:a="http://schemas.openxmlformats.org/drawingml/2006/main">
+              <a:graphicData uri="http://schemas.openxmlformats.org/drawingml/2006/picture">
+                <pic:pic xmlns:pic="http://schemas.openxmlformats.org/drawingml/2006/picture">
+                  <pic:nvPicPr>
+                    <pic:cNvPr id="1" name=""/>
+                    <pic:cNvPicPr/>
+                  </pic:nvPicPr>
+                  <pic:blipFill>
+                    <a:blip r:embed="rId79"/>
+                    <a:stretch>
+                      <a:fillRect/>
+                    </a:stretch>
+                  </pic:blipFill>
+                  <pic:spPr>
+                    <a:xfrm>
+                      <a:off x="0" y="0"/>
                       <a:ext cx="3265996" cy="272167"/>
                     </a:xfrm>
                     <a:prstGeom prst="rect">
@@ -7535,7 +7722,6 @@
           <w:sz w:val="40"/>
           <w:szCs w:val="40"/>
         </w:rPr>
-        <w:lastRenderedPageBreak/>
         <w:t>-You can use a</w:t>
       </w:r>
       <w:r>
@@ -7550,7 +7736,23 @@
           <w:sz w:val="40"/>
           <w:szCs w:val="40"/>
         </w:rPr>
-        <w:t>class object to construct instances of the class:</w:t>
+        <w:t xml:space="preserve">class object to </w:t>
+      </w:r>
+      <w:r>
+        <w:rPr>
+          <w:b/>
+          <w:bCs/>
+          <w:sz w:val="40"/>
+          <w:szCs w:val="40"/>
+        </w:rPr>
+        <w:t>construct</w:t>
+      </w:r>
+      <w:r>
+        <w:rPr>
+          <w:sz w:val="40"/>
+          <w:szCs w:val="40"/>
+        </w:rPr>
+        <w:t xml:space="preserve"> instances of the class:</w:t>
       </w:r>
     </w:p>
     <w:p>
@@ -7582,7 +7784,7 @@
                     <pic:cNvPicPr/>
                   </pic:nvPicPr>
                   <pic:blipFill>
-                    <a:blip r:embed="rId77"/>
+                    <a:blip r:embed="rId80"/>
                     <a:stretch>
                       <a:fillRect/>
                     </a:stretch>
@@ -7633,6 +7835,7 @@
           <w:sz w:val="40"/>
           <w:szCs w:val="40"/>
         </w:rPr>
+        <w:lastRenderedPageBreak/>
         <w:t>5.7.2 A Primer on declaring exceptions</w:t>
       </w:r>
     </w:p>
@@ -7783,7 +7986,7 @@
                     <pic:cNvPicPr/>
                   </pic:nvPicPr>
                   <pic:blipFill>
-                    <a:blip r:embed="rId78"/>
+                    <a:blip r:embed="rId81"/>
                     <a:stretch>
                       <a:fillRect/>
                     </a:stretch>
@@ -7837,55 +8040,408 @@
           <w:sz w:val="40"/>
           <w:szCs w:val="40"/>
         </w:rPr>
+        <w:t>5.7.3 Resources</w:t>
+      </w:r>
+    </w:p>
+    <w:p>
+      <w:pPr>
+        <w:rPr>
+          <w:i/>
+          <w:sz w:val="40"/>
+          <w:szCs w:val="40"/>
+        </w:rPr>
+      </w:pPr>
+      <w:r>
+        <w:rPr>
+          <w:sz w:val="40"/>
+          <w:szCs w:val="40"/>
+        </w:rPr>
+        <w:t xml:space="preserve">-Classes often have associated data files: image and sound file, text files with message. It’s </w:t>
+      </w:r>
+      <w:r>
+        <w:rPr>
+          <w:b/>
+          <w:sz w:val="40"/>
+          <w:szCs w:val="40"/>
+        </w:rPr>
+        <w:t>resource</w:t>
+      </w:r>
+    </w:p>
+    <w:p>
+      <w:pPr>
+        <w:rPr>
+          <w:sz w:val="40"/>
+          <w:szCs w:val="40"/>
+        </w:rPr>
+      </w:pPr>
+      <w:r>
+        <w:rPr>
+          <w:sz w:val="40"/>
+          <w:szCs w:val="40"/>
+        </w:rPr>
+        <w:t xml:space="preserve">-The </w:t>
+      </w:r>
+      <w:r>
+        <w:rPr>
+          <w:b/>
+          <w:sz w:val="40"/>
+          <w:szCs w:val="40"/>
+        </w:rPr>
+        <w:t>Class</w:t>
+      </w:r>
+      <w:r>
+        <w:rPr>
+          <w:sz w:val="40"/>
+          <w:szCs w:val="40"/>
+        </w:rPr>
+        <w:t xml:space="preserve"> </w:t>
+      </w:r>
+      <w:proofErr w:type="spellStart"/>
+      <w:r>
+        <w:rPr>
+          <w:sz w:val="40"/>
+          <w:szCs w:val="40"/>
+        </w:rPr>
+        <w:t>class</w:t>
+      </w:r>
+      <w:proofErr w:type="spellEnd"/>
+      <w:r>
+        <w:rPr>
+          <w:sz w:val="40"/>
+          <w:szCs w:val="40"/>
+        </w:rPr>
+        <w:t xml:space="preserve"> provides a useful service for locating resource files. p269</w:t>
+      </w:r>
+    </w:p>
+    <w:p>
+      <w:pPr>
+        <w:rPr>
+          <w:sz w:val="40"/>
+          <w:szCs w:val="40"/>
+        </w:rPr>
+      </w:pPr>
+      <w:r>
+        <w:rPr>
+          <w:sz w:val="40"/>
+          <w:szCs w:val="40"/>
+        </w:rPr>
+        <w:t xml:space="preserve">+Class: </w:t>
+      </w:r>
+      <w:proofErr w:type="spellStart"/>
+      <w:r>
+        <w:rPr>
+          <w:sz w:val="40"/>
+          <w:szCs w:val="40"/>
+        </w:rPr>
+        <w:t>getResource</w:t>
+      </w:r>
+      <w:proofErr w:type="spellEnd"/>
+      <w:r>
+        <w:rPr>
+          <w:sz w:val="40"/>
+          <w:szCs w:val="40"/>
+        </w:rPr>
+        <w:t xml:space="preserve">(), </w:t>
+      </w:r>
+      <w:proofErr w:type="spellStart"/>
+      <w:r>
+        <w:rPr>
+          <w:sz w:val="40"/>
+          <w:szCs w:val="40"/>
+        </w:rPr>
+        <w:t>getResourceAsStream</w:t>
+      </w:r>
+      <w:proofErr w:type="spellEnd"/>
+    </w:p>
+    <w:p>
+      <w:pPr>
+        <w:pStyle w:val="Heading2"/>
+        <w:rPr>
+          <w:color w:val="FF0000"/>
+          <w:sz w:val="40"/>
+          <w:szCs w:val="40"/>
+        </w:rPr>
+      </w:pPr>
+      <w:r>
+        <w:rPr>
+          <w:color w:val="FF0000"/>
+          <w:sz w:val="40"/>
+          <w:szCs w:val="40"/>
+        </w:rPr>
         <w:lastRenderedPageBreak/>
-        <w:t>5.7.3 Resources</w:t>
-      </w:r>
-    </w:p>
-    <w:p>
-      <w:pPr>
-        <w:rPr>
-          <w:i/>
-          <w:sz w:val="40"/>
-          <w:szCs w:val="40"/>
-        </w:rPr>
-      </w:pPr>
-      <w:r>
-        <w:rPr>
-          <w:sz w:val="40"/>
-          <w:szCs w:val="40"/>
-        </w:rPr>
-        <w:t xml:space="preserve">-Classes often have associated data files: image and sound file, text files with message. It’s </w:t>
-      </w:r>
+        <w:t>5.7.4 Using Reflection to analyze the capabilities of classes</w:t>
+      </w:r>
+    </w:p>
+    <w:p>
+      <w:pPr>
+        <w:rPr>
+          <w:sz w:val="40"/>
+          <w:szCs w:val="40"/>
+        </w:rPr>
+      </w:pPr>
+      <w:r>
+        <w:rPr>
+          <w:sz w:val="40"/>
+          <w:szCs w:val="40"/>
+        </w:rPr>
+        <w:t>-</w:t>
+      </w:r>
+      <w:proofErr w:type="spellStart"/>
       <w:r>
         <w:rPr>
           <w:b/>
-          <w:sz w:val="40"/>
-          <w:szCs w:val="40"/>
-        </w:rPr>
-        <w:t>resource</w:t>
-      </w:r>
-    </w:p>
-    <w:p>
-      <w:pPr>
-        <w:rPr>
-          <w:sz w:val="40"/>
-          <w:szCs w:val="40"/>
-        </w:rPr>
-      </w:pPr>
-      <w:r>
-        <w:rPr>
-          <w:sz w:val="40"/>
-          <w:szCs w:val="40"/>
-        </w:rPr>
-        <w:t xml:space="preserve">-The </w:t>
-      </w:r>
-      <w:r>
+          <w:bCs/>
+          <w:sz w:val="40"/>
+          <w:szCs w:val="40"/>
+        </w:rPr>
+        <w:t>java.lang.reflect</w:t>
+      </w:r>
+      <w:proofErr w:type="spellEnd"/>
+      <w:r>
+        <w:rPr>
+          <w:sz w:val="40"/>
+          <w:szCs w:val="40"/>
+        </w:rPr>
+        <w:t xml:space="preserve">: Field, Method, Constructor class </w:t>
+      </w:r>
+    </w:p>
+    <w:p>
+      <w:pPr>
         <w:rPr>
           <w:b/>
-          <w:sz w:val="40"/>
-          <w:szCs w:val="40"/>
-        </w:rPr>
-        <w:t>Class</w:t>
+          <w:bCs/>
+          <w:sz w:val="40"/>
+          <w:szCs w:val="40"/>
+        </w:rPr>
+      </w:pPr>
+      <w:r>
+        <w:rPr>
+          <w:sz w:val="40"/>
+          <w:szCs w:val="40"/>
+        </w:rPr>
+        <w:t xml:space="preserve">+All 3 classes have </w:t>
+      </w:r>
+      <w:proofErr w:type="spellStart"/>
+      <w:r>
+        <w:rPr>
+          <w:b/>
+          <w:bCs/>
+          <w:sz w:val="40"/>
+          <w:szCs w:val="40"/>
+        </w:rPr>
+        <w:t>getName</w:t>
+      </w:r>
+      <w:proofErr w:type="spellEnd"/>
+      <w:r>
+        <w:rPr>
+          <w:b/>
+          <w:bCs/>
+          <w:sz w:val="40"/>
+          <w:szCs w:val="40"/>
+        </w:rPr>
+        <w:t>()</w:t>
+      </w:r>
+    </w:p>
+    <w:p>
+      <w:pPr>
+        <w:rPr>
+          <w:sz w:val="40"/>
+          <w:szCs w:val="40"/>
+        </w:rPr>
+      </w:pPr>
+      <w:r>
+        <w:rPr>
+          <w:b/>
+          <w:bCs/>
+          <w:sz w:val="40"/>
+          <w:szCs w:val="40"/>
+        </w:rPr>
+        <w:t>+</w:t>
+      </w:r>
+      <w:proofErr w:type="spellStart"/>
+      <w:r>
+        <w:rPr>
+          <w:b/>
+          <w:bCs/>
+          <w:sz w:val="40"/>
+          <w:szCs w:val="40"/>
+        </w:rPr>
+        <w:t>getModifier</w:t>
+      </w:r>
+      <w:proofErr w:type="spellEnd"/>
+      <w:r>
+        <w:rPr>
+          <w:b/>
+          <w:bCs/>
+          <w:sz w:val="40"/>
+          <w:szCs w:val="40"/>
+        </w:rPr>
+        <w:t>()</w:t>
+      </w:r>
+      <w:r>
+        <w:rPr>
+          <w:sz w:val="40"/>
+          <w:szCs w:val="40"/>
+        </w:rPr>
+        <w:t xml:space="preserve">: return int with various bits turned on and off that describe the modifiers used. You can use </w:t>
+      </w:r>
+      <w:r>
+        <w:rPr>
+          <w:b/>
+          <w:bCs/>
+          <w:sz w:val="40"/>
+          <w:szCs w:val="40"/>
+        </w:rPr>
+        <w:t>Modifier static methods</w:t>
+      </w:r>
+      <w:r>
+        <w:rPr>
+          <w:sz w:val="40"/>
+          <w:szCs w:val="40"/>
+        </w:rPr>
+        <w:t xml:space="preserve">: </w:t>
+      </w:r>
+      <w:proofErr w:type="spellStart"/>
+      <w:r>
+        <w:rPr>
+          <w:sz w:val="40"/>
+          <w:szCs w:val="40"/>
+        </w:rPr>
+        <w:t>isPublic</w:t>
+      </w:r>
+      <w:proofErr w:type="spellEnd"/>
+      <w:r>
+        <w:rPr>
+          <w:sz w:val="40"/>
+          <w:szCs w:val="40"/>
+        </w:rPr>
+        <w:t xml:space="preserve">(), </w:t>
+      </w:r>
+      <w:proofErr w:type="spellStart"/>
+      <w:r>
+        <w:rPr>
+          <w:sz w:val="40"/>
+          <w:szCs w:val="40"/>
+        </w:rPr>
+        <w:t>isPrivate</w:t>
+      </w:r>
+      <w:proofErr w:type="spellEnd"/>
+      <w:r>
+        <w:rPr>
+          <w:sz w:val="40"/>
+          <w:szCs w:val="40"/>
+        </w:rPr>
+        <w:t xml:space="preserve">(), </w:t>
+      </w:r>
+      <w:proofErr w:type="spellStart"/>
+      <w:r>
+        <w:rPr>
+          <w:sz w:val="40"/>
+          <w:szCs w:val="40"/>
+        </w:rPr>
+        <w:t>isFinal</w:t>
+      </w:r>
+      <w:proofErr w:type="spellEnd"/>
+      <w:r>
+        <w:rPr>
+          <w:sz w:val="40"/>
+          <w:szCs w:val="40"/>
+        </w:rPr>
+        <w:t xml:space="preserve">(), </w:t>
+      </w:r>
+      <w:proofErr w:type="spellStart"/>
+      <w:r>
+        <w:rPr>
+          <w:sz w:val="40"/>
+          <w:szCs w:val="40"/>
+        </w:rPr>
+        <w:t>toString</w:t>
+      </w:r>
+      <w:proofErr w:type="spellEnd"/>
+      <w:r>
+        <w:rPr>
+          <w:sz w:val="40"/>
+          <w:szCs w:val="40"/>
+        </w:rPr>
+        <w:t>()</w:t>
+      </w:r>
+    </w:p>
+    <w:p>
+      <w:pPr>
+        <w:rPr>
+          <w:sz w:val="40"/>
+          <w:szCs w:val="40"/>
+        </w:rPr>
+      </w:pPr>
+      <w:r>
+        <w:rPr>
+          <w:sz w:val="40"/>
+          <w:szCs w:val="40"/>
+        </w:rPr>
+        <w:t xml:space="preserve">-Class: </w:t>
+      </w:r>
+      <w:proofErr w:type="spellStart"/>
+      <w:r>
+        <w:rPr>
+          <w:sz w:val="40"/>
+          <w:szCs w:val="40"/>
+        </w:rPr>
+        <w:t>getField</w:t>
+      </w:r>
+      <w:proofErr w:type="spellEnd"/>
+      <w:r>
+        <w:rPr>
+          <w:sz w:val="40"/>
+          <w:szCs w:val="40"/>
+        </w:rPr>
+        <w:t xml:space="preserve">(), </w:t>
+      </w:r>
+      <w:proofErr w:type="spellStart"/>
+      <w:r>
+        <w:rPr>
+          <w:sz w:val="40"/>
+          <w:szCs w:val="40"/>
+        </w:rPr>
+        <w:t>getMethod</w:t>
+      </w:r>
+      <w:proofErr w:type="spellEnd"/>
+      <w:r>
+        <w:rPr>
+          <w:sz w:val="40"/>
+          <w:szCs w:val="40"/>
+        </w:rPr>
+        <w:t xml:space="preserve">(), </w:t>
+      </w:r>
+      <w:proofErr w:type="spellStart"/>
+      <w:r>
+        <w:rPr>
+          <w:sz w:val="40"/>
+          <w:szCs w:val="40"/>
+        </w:rPr>
+        <w:t>getConstructor</w:t>
+      </w:r>
+      <w:proofErr w:type="spellEnd"/>
+      <w:r>
+        <w:rPr>
+          <w:sz w:val="40"/>
+          <w:szCs w:val="40"/>
+        </w:rPr>
+        <w:t>()</w:t>
+      </w:r>
+    </w:p>
+    <w:p>
+      <w:pPr>
+        <w:rPr>
+          <w:sz w:val="40"/>
+          <w:szCs w:val="40"/>
+        </w:rPr>
+      </w:pPr>
+      <w:r>
+        <w:rPr>
+          <w:sz w:val="40"/>
+          <w:szCs w:val="40"/>
+        </w:rPr>
+        <w:t>-Class:</w:t>
       </w:r>
       <w:r>
         <w:rPr>
@@ -7900,7 +8456,14 @@
           <w:sz w:val="40"/>
           <w:szCs w:val="40"/>
         </w:rPr>
-        <w:t>class</w:t>
+        <w:t>getField</w:t>
+      </w:r>
+      <w:r>
+        <w:rPr>
+          <w:sz w:val="40"/>
+          <w:szCs w:val="40"/>
+        </w:rPr>
+        <w:t>s</w:t>
       </w:r>
       <w:proofErr w:type="spellEnd"/>
       <w:r>
@@ -7908,40 +8471,7 @@
           <w:sz w:val="40"/>
           <w:szCs w:val="40"/>
         </w:rPr>
-        <w:t xml:space="preserve"> provides a useful service for locating resource files. p269</w:t>
-      </w:r>
-    </w:p>
-    <w:p>
-      <w:pPr>
-        <w:pStyle w:val="Heading2"/>
-        <w:rPr>
-          <w:color w:val="FF0000"/>
-          <w:sz w:val="40"/>
-          <w:szCs w:val="40"/>
-        </w:rPr>
-      </w:pPr>
-      <w:r>
-        <w:rPr>
-          <w:color w:val="FF0000"/>
-          <w:sz w:val="40"/>
-          <w:szCs w:val="40"/>
-        </w:rPr>
-        <w:t>5.7.4 Using Reflection to analyze the capabilities of classes</w:t>
-      </w:r>
-    </w:p>
-    <w:p>
-      <w:pPr>
-        <w:rPr>
-          <w:sz w:val="40"/>
-          <w:szCs w:val="40"/>
-        </w:rPr>
-      </w:pPr>
-      <w:r>
-        <w:rPr>
-          <w:sz w:val="40"/>
-          <w:szCs w:val="40"/>
-        </w:rPr>
-        <w:t>-</w:t>
+        <w:t xml:space="preserve">(), </w:t>
       </w:r>
       <w:proofErr w:type="spellStart"/>
       <w:r>
@@ -7949,7 +8479,14 @@
           <w:sz w:val="40"/>
           <w:szCs w:val="40"/>
         </w:rPr>
-        <w:t>java.lang.reflect</w:t>
+        <w:t>getMethod</w:t>
+      </w:r>
+      <w:r>
+        <w:rPr>
+          <w:sz w:val="40"/>
+          <w:szCs w:val="40"/>
+        </w:rPr>
+        <w:t>s</w:t>
       </w:r>
       <w:proofErr w:type="spellEnd"/>
       <w:r>
@@ -7957,8 +8494,181 @@
           <w:sz w:val="40"/>
           <w:szCs w:val="40"/>
         </w:rPr>
-        <w:t xml:space="preserve">: Field, Method, Constructor class </w:t>
-      </w:r>
+        <w:t xml:space="preserve">(), </w:t>
+      </w:r>
+      <w:proofErr w:type="spellStart"/>
+      <w:r>
+        <w:rPr>
+          <w:sz w:val="40"/>
+          <w:szCs w:val="40"/>
+        </w:rPr>
+        <w:t>getConstructor</w:t>
+      </w:r>
+      <w:r>
+        <w:rPr>
+          <w:sz w:val="40"/>
+          <w:szCs w:val="40"/>
+        </w:rPr>
+        <w:t>s</w:t>
+      </w:r>
+      <w:proofErr w:type="spellEnd"/>
+      <w:r>
+        <w:rPr>
+          <w:sz w:val="40"/>
+          <w:szCs w:val="40"/>
+        </w:rPr>
+        <w:t>()</w:t>
+      </w:r>
+      <w:r>
+        <w:rPr>
+          <w:sz w:val="40"/>
+          <w:szCs w:val="40"/>
+        </w:rPr>
+        <w:t xml:space="preserve"> return </w:t>
+      </w:r>
+      <w:r>
+        <w:rPr>
+          <w:b/>
+          <w:bCs/>
+          <w:sz w:val="40"/>
+          <w:szCs w:val="40"/>
+        </w:rPr>
+        <w:t>arrays</w:t>
+      </w:r>
+      <w:r>
+        <w:rPr>
+          <w:sz w:val="40"/>
+          <w:szCs w:val="40"/>
+        </w:rPr>
+        <w:t xml:space="preserve"> of </w:t>
+      </w:r>
+      <w:r>
+        <w:rPr>
+          <w:b/>
+          <w:bCs/>
+          <w:sz w:val="40"/>
+          <w:szCs w:val="40"/>
+        </w:rPr>
+        <w:t>public</w:t>
+      </w:r>
+      <w:r>
+        <w:rPr>
+          <w:sz w:val="40"/>
+          <w:szCs w:val="40"/>
+        </w:rPr>
+        <w:t xml:space="preserve"> fields, methods and constructors.</w:t>
+      </w:r>
+    </w:p>
+    <w:p>
+      <w:pPr>
+        <w:rPr>
+          <w:sz w:val="40"/>
+          <w:szCs w:val="40"/>
+        </w:rPr>
+      </w:pPr>
+      <w:r>
+        <w:rPr>
+          <w:sz w:val="40"/>
+          <w:szCs w:val="40"/>
+        </w:rPr>
+        <w:t xml:space="preserve">-Class: </w:t>
+      </w:r>
+      <w:proofErr w:type="spellStart"/>
+      <w:r>
+        <w:rPr>
+          <w:sz w:val="40"/>
+          <w:szCs w:val="40"/>
+        </w:rPr>
+        <w:t>getDeclaredFields</w:t>
+      </w:r>
+      <w:proofErr w:type="spellEnd"/>
+      <w:r>
+        <w:rPr>
+          <w:sz w:val="40"/>
+          <w:szCs w:val="40"/>
+        </w:rPr>
+        <w:t xml:space="preserve">(), </w:t>
+      </w:r>
+      <w:proofErr w:type="spellStart"/>
+      <w:r>
+        <w:rPr>
+          <w:sz w:val="40"/>
+          <w:szCs w:val="40"/>
+        </w:rPr>
+        <w:t>getDeclaredMethods</w:t>
+      </w:r>
+      <w:proofErr w:type="spellEnd"/>
+      <w:r>
+        <w:rPr>
+          <w:sz w:val="40"/>
+          <w:szCs w:val="40"/>
+        </w:rPr>
+        <w:t xml:space="preserve">(), </w:t>
+      </w:r>
+      <w:proofErr w:type="spellStart"/>
+      <w:r>
+        <w:rPr>
+          <w:sz w:val="40"/>
+          <w:szCs w:val="40"/>
+        </w:rPr>
+        <w:t>getDeclaredConstructors</w:t>
+      </w:r>
+      <w:proofErr w:type="spellEnd"/>
+      <w:r>
+        <w:rPr>
+          <w:sz w:val="40"/>
+          <w:szCs w:val="40"/>
+        </w:rPr>
+        <w:t xml:space="preserve">() return arrays all fields, methods and constructors </w:t>
+      </w:r>
+      <w:r>
+        <w:rPr>
+          <w:b/>
+          <w:bCs/>
+          <w:sz w:val="40"/>
+          <w:szCs w:val="40"/>
+        </w:rPr>
+        <w:t>declared</w:t>
+      </w:r>
+      <w:r>
+        <w:rPr>
+          <w:sz w:val="40"/>
+          <w:szCs w:val="40"/>
+        </w:rPr>
+        <w:t xml:space="preserve"> in class. This includes private, package, protected members (not </w:t>
+      </w:r>
+      <w:proofErr w:type="spellStart"/>
+      <w:r>
+        <w:rPr>
+          <w:sz w:val="40"/>
+          <w:szCs w:val="40"/>
+        </w:rPr>
+        <w:t>superclasses</w:t>
+      </w:r>
+      <w:proofErr w:type="spellEnd"/>
+      <w:r>
+        <w:rPr>
+          <w:sz w:val="40"/>
+          <w:szCs w:val="40"/>
+        </w:rPr>
+        <w:t xml:space="preserve"> members)</w:t>
+      </w:r>
+    </w:p>
+    <w:p>
+      <w:pPr>
+        <w:rPr>
+          <w:sz w:val="40"/>
+          <w:szCs w:val="40"/>
+        </w:rPr>
+      </w:pPr>
+    </w:p>
+    <w:p>
+      <w:pPr>
+        <w:rPr>
+          <w:sz w:val="40"/>
+          <w:szCs w:val="40"/>
+        </w:rPr>
+      </w:pPr>
     </w:p>
     <w:p>
       <w:pPr>
@@ -8035,6 +8745,7 @@
           <w:sz w:val="40"/>
           <w:szCs w:val="40"/>
         </w:rPr>
+        <w:lastRenderedPageBreak/>
         <w:t>5.8 Design Hints for Inheritance</w:t>
       </w:r>
     </w:p>
@@ -8049,7 +8760,7 @@
 </file>
 
 <file path=word/styles.xml><?xml version="1.0" encoding="utf-8"?>
-<w:styles xmlns:mc="http://schemas.openxmlformats.org/markup-compatibility/2006" xmlns:r="http://schemas.openxmlformats.org/officeDocument/2006/relationships" xmlns:w="http://schemas.openxmlformats.org/wordprocessingml/2006/main" xmlns:w14="http://schemas.microsoft.com/office/word/2010/wordml" xmlns:w15="http://schemas.microsoft.com/office/word/2012/wordml" xmlns:w16se="http://schemas.microsoft.com/office/word/2015/wordml/symex" mc:Ignorable="w14 w15 w16se">
+<w:styles xmlns:mc="http://schemas.openxmlformats.org/markup-compatibility/2006" xmlns:r="http://schemas.openxmlformats.org/officeDocument/2006/relationships" xmlns:w="http://schemas.openxmlformats.org/wordprocessingml/2006/main" xmlns:w14="http://schemas.microsoft.com/office/word/2010/wordml" xmlns:w15="http://schemas.microsoft.com/office/word/2012/wordml" xmlns:w16cex="http://schemas.microsoft.com/office/word/2018/wordml/cex" xmlns:w16cid="http://schemas.microsoft.com/office/word/2016/wordml/cid" xmlns:w16="http://schemas.microsoft.com/office/word/2018/wordml" xmlns:w16du="http://schemas.microsoft.com/office/word/2023/wordml/word16du" xmlns:w16sdtdh="http://schemas.microsoft.com/office/word/2020/wordml/sdtdatahash" xmlns:w16sdtfl="http://schemas.microsoft.com/office/word/2024/wordml/sdtformatlock" xmlns:w16se="http://schemas.microsoft.com/office/word/2015/wordml/symex" mc:Ignorable="w14 w15 w16se w16cid w16 w16cex w16sdtdh w16sdtfl w16du">
   <w:docDefaults>
     <w:rPrDefault>
       <w:rPr>
@@ -8065,7 +8776,7 @@
       </w:pPr>
     </w:pPrDefault>
   </w:docDefaults>
-  <w:latentStyles w:defLockedState="0" w:defUIPriority="99" w:defSemiHidden="0" w:defUnhideWhenUsed="0" w:defQFormat="0" w:count="371">
+  <w:latentStyles w:defLockedState="0" w:defUIPriority="99" w:defSemiHidden="0" w:defUnhideWhenUsed="0" w:defQFormat="0" w:count="376">
     <w:lsdException w:name="Normal" w:uiPriority="0" w:qFormat="1"/>
     <w:lsdException w:name="heading 1" w:uiPriority="9" w:qFormat="1"/>
     <w:lsdException w:name="heading 2" w:semiHidden="1" w:uiPriority="9" w:unhideWhenUsed="1" w:qFormat="1"/>
@@ -8437,6 +9148,11 @@
     <w:lsdException w:name="List Table 5 Dark Accent 6" w:uiPriority="50"/>
     <w:lsdException w:name="List Table 6 Colorful Accent 6" w:uiPriority="51"/>
     <w:lsdException w:name="List Table 7 Colorful Accent 6" w:uiPriority="52"/>
+    <w:lsdException w:name="Mention" w:semiHidden="1" w:unhideWhenUsed="1"/>
+    <w:lsdException w:name="Smart Hyperlink" w:semiHidden="1" w:unhideWhenUsed="1"/>
+    <w:lsdException w:name="Hashtag" w:semiHidden="1" w:unhideWhenUsed="1"/>
+    <w:lsdException w:name="Unresolved Mention" w:semiHidden="1" w:unhideWhenUsed="1"/>
+    <w:lsdException w:name="Smart Link" w:semiHidden="1" w:unhideWhenUsed="1"/>
   </w:latentStyles>
   <w:style w:type="paragraph" w:default="1" w:styleId="Normal">
     <w:name w:val="Normal"/>

</xml_diff>